<commit_message>
docs: prepare pilot onboarding and commercial execution packs
</commit_message>
<xml_diff>
--- a/docs/CogniVault_Medical_AI_Proje_Dosyasi.docx
+++ b/docs/CogniVault_Medical_AI_Proje_Dosyasi.docx
@@ -7758,6 +7758,1737 @@
           <w:szCs w:val="19"/>
         </w:rPr>
         <w:t xml:space="preserve">Bu doküman 23 Haziran 2026 itibarıyla projenin durumunu yansıtır. Metrikler (ECE 0,0107; %99,3 branş doğruluğu; 526 backend testi) o tarihteki kod tabanında ölçülmüştür.</w:t>
+      </w:r>
+    </w:p>
+    <w:p>
+      <w:r>
+        <w:br w:type="page"/>
+      </w:r>
+    </w:p>
+    <w:p>
+      <w:pPr>
+        <w:spacing w:before="0" w:after="120"/>
+      </w:pPr>
+      <w:r>
+        <w:rPr>
+          <w:rFonts w:ascii="Arial" w:hAnsi="Arial" w:eastAsia="Arial"/>
+          <w:b/>
+          <w:color w:val="1F4E5F"/>
+          <w:sz w:val="36"/>
+        </w:rPr>
+        <w:t>13. 30 Haziran 2026 Icra Eki - Saha, Onboarding ve Ticarilestirme</w:t>
+      </w:r>
+    </w:p>
+    <w:p>
+      <w:pPr>
+        <w:spacing w:before="0" w:after="160" w:line="259" w:lineRule="auto"/>
+      </w:pPr>
+      <w:r>
+        <w:rPr>
+          <w:rFonts w:ascii="Arial" w:hAnsi="Arial" w:eastAsia="Arial"/>
+          <w:b/>
+          <w:color w:val="1C2B2A"/>
+          <w:sz w:val="21"/>
+        </w:rPr>
+        <w:t xml:space="preserve">Karar ozeti: </w:t>
+      </w:r>
+      <w:r>
+        <w:rPr>
+          <w:rFonts w:ascii="Arial" w:hAnsi="Arial" w:eastAsia="Arial"/>
+          <w:color w:val="1C2B2A"/>
+          <w:sz w:val="21"/>
+        </w:rPr>
+        <w:t>Teknik Ar-Ge cekirdegi guclu sekilde kanitlandi; siradaki kaldirac kod yazmaktan cok pilot saha dogrulamasi, klinik onboarding, fiyat validasyonu ve patent vekili surecidir. Masa-basinda hazirlanabilecek paketler bu ekle kapatildi; dis bagimlilik isteyen adimlar acik kabul kriterleriyle asagiya yazildi.</w:t>
+      </w:r>
+    </w:p>
+    <w:p>
+      <w:pPr>
+        <w:spacing w:before="160" w:after="120"/>
+      </w:pPr>
+      <w:r>
+        <w:rPr>
+          <w:rFonts w:ascii="Arial" w:hAnsi="Arial" w:eastAsia="Arial"/>
+          <w:b/>
+          <w:color w:val="1F4E5F"/>
+          <w:sz w:val="26"/>
+        </w:rPr>
+        <w:t>13.1 Bu turda kapatilan masa-basi paketler</w:t>
+      </w:r>
+    </w:p>
+    <w:tbl>
+      <w:tblPr>
+        <w:tblW w:type="auto" w:w="0"/>
+        <w:jc w:val="center"/>
+        <w:tblLayout w:type="fixed"/>
+        <w:tblLook w:firstColumn="1" w:firstRow="1" w:lastColumn="0" w:lastRow="0" w:noHBand="0" w:noVBand="1" w:val="04A0"/>
+        <w:tblBorders>
+          <w:top w:val="single" w:sz="4" w:space="0" w:color="D4E3E0"/>
+          <w:left w:val="single" w:sz="4" w:space="0" w:color="D4E3E0"/>
+          <w:bottom w:val="single" w:sz="4" w:space="0" w:color="D4E3E0"/>
+          <w:right w:val="single" w:sz="4" w:space="0" w:color="D4E3E0"/>
+          <w:insideH w:val="single" w:sz="4" w:space="0" w:color="D4E3E0"/>
+          <w:insideV w:val="single" w:sz="4" w:space="0" w:color="D4E3E0"/>
+        </w:tblBorders>
+      </w:tblPr>
+      <w:tblGrid>
+        <w:gridCol w:w="2256"/>
+        <w:gridCol w:w="2256"/>
+        <w:gridCol w:w="2256"/>
+        <w:gridCol w:w="2256"/>
+      </w:tblGrid>
+      <w:tr>
+        <w:tc>
+          <w:tcPr>
+            <w:tcW w:type="dxa" w:w="1080"/>
+            <w:vAlign w:val="center"/>
+            <w:shd w:fill="1F4E5F"/>
+          </w:tcPr>
+          <w:p>
+            <w:pPr>
+              <w:spacing w:before="0" w:after="40"/>
+              <w:jc w:val="left"/>
+            </w:pPr>
+            <w:r/>
+            <w:r>
+              <w:rPr>
+                <w:rFonts w:ascii="Arial" w:hAnsi="Arial" w:eastAsia="Arial"/>
+                <w:b/>
+                <w:color w:val="FFFFFF"/>
+                <w:sz w:val="16"/>
+              </w:rPr>
+              <w:t>Is paketi</w:t>
+            </w:r>
+          </w:p>
+        </w:tc>
+        <w:tc>
+          <w:tcPr>
+            <w:tcW w:type="dxa" w:w="3240"/>
+            <w:vAlign w:val="center"/>
+            <w:shd w:fill="1F4E5F"/>
+          </w:tcPr>
+          <w:p>
+            <w:pPr>
+              <w:spacing w:before="0" w:after="40"/>
+              <w:jc w:val="left"/>
+            </w:pPr>
+            <w:r/>
+            <w:r>
+              <w:rPr>
+                <w:rFonts w:ascii="Arial" w:hAnsi="Arial" w:eastAsia="Arial"/>
+                <w:b/>
+                <w:color w:val="FFFFFF"/>
+                <w:sz w:val="16"/>
+              </w:rPr>
+              <w:t>Yeni cikti</w:t>
+            </w:r>
+          </w:p>
+        </w:tc>
+        <w:tc>
+          <w:tcPr>
+            <w:tcW w:type="dxa" w:w="2376"/>
+            <w:vAlign w:val="center"/>
+            <w:shd w:fill="1F4E5F"/>
+          </w:tcPr>
+          <w:p>
+            <w:pPr>
+              <w:spacing w:before="0" w:after="40"/>
+              <w:jc w:val="left"/>
+            </w:pPr>
+            <w:r/>
+            <w:r>
+              <w:rPr>
+                <w:rFonts w:ascii="Arial" w:hAnsi="Arial" w:eastAsia="Arial"/>
+                <w:b/>
+                <w:color w:val="FFFFFF"/>
+                <w:sz w:val="16"/>
+              </w:rPr>
+              <w:t>Durum</w:t>
+            </w:r>
+          </w:p>
+        </w:tc>
+        <w:tc>
+          <w:tcPr>
+            <w:tcW w:type="dxa" w:w="2952"/>
+            <w:vAlign w:val="center"/>
+            <w:shd w:fill="1F4E5F"/>
+          </w:tcPr>
+          <w:p>
+            <w:pPr>
+              <w:spacing w:before="0" w:after="40"/>
+              <w:jc w:val="left"/>
+            </w:pPr>
+            <w:r/>
+            <w:r>
+              <w:rPr>
+                <w:rFonts w:ascii="Arial" w:hAnsi="Arial" w:eastAsia="Arial"/>
+                <w:b/>
+                <w:color w:val="FFFFFF"/>
+                <w:sz w:val="16"/>
+              </w:rPr>
+              <w:t>Repo kaniti</w:t>
+            </w:r>
+          </w:p>
+        </w:tc>
+      </w:tr>
+      <w:tr>
+        <w:tc>
+          <w:tcPr>
+            <w:tcW w:type="dxa" w:w="1080"/>
+            <w:vAlign w:val="center"/>
+          </w:tcPr>
+          <w:p>
+            <w:pPr>
+              <w:spacing w:before="0" w:after="40"/>
+              <w:jc w:val="left"/>
+            </w:pPr>
+            <w:r/>
+            <w:r>
+              <w:rPr>
+                <w:rFonts w:ascii="Arial" w:hAnsi="Arial" w:eastAsia="Arial"/>
+                <w:b w:val="0"/>
+                <w:color w:val="1C2B2A"/>
+                <w:sz w:val="16"/>
+              </w:rPr>
+              <w:t>IP-5.1</w:t>
+            </w:r>
+          </w:p>
+        </w:tc>
+        <w:tc>
+          <w:tcPr>
+            <w:tcW w:type="dxa" w:w="3240"/>
+            <w:vAlign w:val="center"/>
+          </w:tcPr>
+          <w:p>
+            <w:pPr>
+              <w:spacing w:before="0" w:after="40"/>
+              <w:jc w:val="left"/>
+            </w:pPr>
+            <w:r/>
+            <w:r>
+              <w:rPr>
+                <w:rFonts w:ascii="Arial" w:hAnsi="Arial" w:eastAsia="Arial"/>
+                <w:b w:val="0"/>
+                <w:color w:val="1C2B2A"/>
+                <w:sz w:val="16"/>
+              </w:rPr>
+              <w:t>Pilot klinik launch pack: secim kriterleri, 30 gunluk saha takvimi, KVKK/sozlesme checklist, kabul kapilari.</w:t>
+            </w:r>
+          </w:p>
+        </w:tc>
+        <w:tc>
+          <w:tcPr>
+            <w:tcW w:type="dxa" w:w="2376"/>
+            <w:vAlign w:val="center"/>
+          </w:tcPr>
+          <w:p>
+            <w:pPr>
+              <w:spacing w:before="0" w:after="40"/>
+              <w:jc w:val="left"/>
+            </w:pPr>
+            <w:r/>
+            <w:r>
+              <w:rPr>
+                <w:rFonts w:ascii="Arial" w:hAnsi="Arial" w:eastAsia="Arial"/>
+                <w:b w:val="0"/>
+                <w:color w:val="1C2B2A"/>
+                <w:sz w:val="16"/>
+              </w:rPr>
+              <w:t>Paket hazir; klinik gorusmesi bekliyor.</w:t>
+            </w:r>
+          </w:p>
+        </w:tc>
+        <w:tc>
+          <w:tcPr>
+            <w:tcW w:type="dxa" w:w="2952"/>
+            <w:vAlign w:val="center"/>
+          </w:tcPr>
+          <w:p>
+            <w:pPr>
+              <w:spacing w:before="0" w:after="40"/>
+              <w:jc w:val="left"/>
+            </w:pPr>
+            <w:r/>
+            <w:r>
+              <w:rPr>
+                <w:rFonts w:ascii="Arial" w:hAnsi="Arial" w:eastAsia="Arial"/>
+                <w:b w:val="0"/>
+                <w:color w:val="1C2B2A"/>
+                <w:sz w:val="16"/>
+              </w:rPr>
+              <w:t>docs/pilot/IP-5.1-pilot-clinic-launch-pack.md</w:t>
+            </w:r>
+          </w:p>
+        </w:tc>
+      </w:tr>
+      <w:tr>
+        <w:tc>
+          <w:tcPr>
+            <w:tcW w:type="dxa" w:w="1080"/>
+            <w:vAlign w:val="center"/>
+          </w:tcPr>
+          <w:p>
+            <w:pPr>
+              <w:spacing w:before="0" w:after="40"/>
+              <w:jc w:val="left"/>
+            </w:pPr>
+            <w:r/>
+            <w:r>
+              <w:rPr>
+                <w:rFonts w:ascii="Arial" w:hAnsi="Arial" w:eastAsia="Arial"/>
+                <w:b w:val="0"/>
+                <w:color w:val="1C2B2A"/>
+                <w:sz w:val="16"/>
+              </w:rPr>
+              <w:t>IP-6.3</w:t>
+            </w:r>
+          </w:p>
+        </w:tc>
+        <w:tc>
+          <w:tcPr>
+            <w:tcW w:type="dxa" w:w="3240"/>
+            <w:vAlign w:val="center"/>
+          </w:tcPr>
+          <w:p>
+            <w:pPr>
+              <w:spacing w:before="0" w:after="40"/>
+              <w:jc w:val="left"/>
+            </w:pPr>
+            <w:r/>
+            <w:r>
+              <w:rPr>
+                <w:rFonts w:ascii="Arial" w:hAnsi="Arial" w:eastAsia="Arial"/>
+                <w:b w:val="0"/>
+                <w:color w:val="1C2B2A"/>
+                <w:sz w:val="16"/>
+              </w:rPr>
+              <w:t>&lt;1 gun onboarding playbook: 6 saatlik kurulum akisi, 10 senaryoluk kabul testi, demo/live ortam disiplini.</w:t>
+            </w:r>
+          </w:p>
+        </w:tc>
+        <w:tc>
+          <w:tcPr>
+            <w:tcW w:type="dxa" w:w="2376"/>
+            <w:vAlign w:val="center"/>
+          </w:tcPr>
+          <w:p>
+            <w:pPr>
+              <w:spacing w:before="0" w:after="40"/>
+              <w:jc w:val="left"/>
+            </w:pPr>
+            <w:r/>
+            <w:r>
+              <w:rPr>
+                <w:rFonts w:ascii="Arial" w:hAnsi="Arial" w:eastAsia="Arial"/>
+                <w:b w:val="0"/>
+                <w:color w:val="1C2B2A"/>
+                <w:sz w:val="16"/>
+              </w:rPr>
+              <w:t>Paket hazir; pilotta kronometreli test bekliyor.</w:t>
+            </w:r>
+          </w:p>
+        </w:tc>
+        <w:tc>
+          <w:tcPr>
+            <w:tcW w:type="dxa" w:w="2952"/>
+            <w:vAlign w:val="center"/>
+          </w:tcPr>
+          <w:p>
+            <w:pPr>
+              <w:spacing w:before="0" w:after="40"/>
+              <w:jc w:val="left"/>
+            </w:pPr>
+            <w:r/>
+            <w:r>
+              <w:rPr>
+                <w:rFonts w:ascii="Arial" w:hAnsi="Arial" w:eastAsia="Arial"/>
+                <w:b w:val="0"/>
+                <w:color w:val="1C2B2A"/>
+                <w:sz w:val="16"/>
+              </w:rPr>
+              <w:t>docs/onboarding/IP-6.3-one-day-onboarding-playbook.md</w:t>
+            </w:r>
+          </w:p>
+        </w:tc>
+      </w:tr>
+      <w:tr>
+        <w:tc>
+          <w:tcPr>
+            <w:tcW w:type="dxa" w:w="1080"/>
+            <w:vAlign w:val="center"/>
+          </w:tcPr>
+          <w:p>
+            <w:pPr>
+              <w:spacing w:before="0" w:after="40"/>
+              <w:jc w:val="left"/>
+            </w:pPr>
+            <w:r/>
+            <w:r>
+              <w:rPr>
+                <w:rFonts w:ascii="Arial" w:hAnsi="Arial" w:eastAsia="Arial"/>
+                <w:b w:val="0"/>
+                <w:color w:val="1C2B2A"/>
+                <w:sz w:val="16"/>
+              </w:rPr>
+              <w:t>IP-6.1</w:t>
+            </w:r>
+          </w:p>
+        </w:tc>
+        <w:tc>
+          <w:tcPr>
+            <w:tcW w:type="dxa" w:w="3240"/>
+            <w:vAlign w:val="center"/>
+          </w:tcPr>
+          <w:p>
+            <w:pPr>
+              <w:spacing w:before="0" w:after="40"/>
+              <w:jc w:val="left"/>
+            </w:pPr>
+            <w:r/>
+            <w:r>
+              <w:rPr>
+                <w:rFonts w:ascii="Arial" w:hAnsi="Arial" w:eastAsia="Arial"/>
+                <w:b w:val="0"/>
+                <w:color w:val="1C2B2A"/>
+                <w:sz w:val="16"/>
+              </w:rPr>
+              <w:t>Starter/Growth/Enterprise fiyat modeli, basari bazli ucret, faturalama olaylari ve billing MVP kapsami.</w:t>
+            </w:r>
+          </w:p>
+        </w:tc>
+        <w:tc>
+          <w:tcPr>
+            <w:tcW w:type="dxa" w:w="2376"/>
+            <w:vAlign w:val="center"/>
+          </w:tcPr>
+          <w:p>
+            <w:pPr>
+              <w:spacing w:before="0" w:after="40"/>
+              <w:jc w:val="left"/>
+            </w:pPr>
+            <w:r/>
+            <w:r>
+              <w:rPr>
+                <w:rFonts w:ascii="Arial" w:hAnsi="Arial" w:eastAsia="Arial"/>
+                <w:b w:val="0"/>
+                <w:color w:val="1C2B2A"/>
+                <w:sz w:val="16"/>
+              </w:rPr>
+              <w:t>Paket hazir; odeme istekliligi validasyonu bekliyor.</w:t>
+            </w:r>
+          </w:p>
+        </w:tc>
+        <w:tc>
+          <w:tcPr>
+            <w:tcW w:type="dxa" w:w="2952"/>
+            <w:vAlign w:val="center"/>
+          </w:tcPr>
+          <w:p>
+            <w:pPr>
+              <w:spacing w:before="0" w:after="40"/>
+              <w:jc w:val="left"/>
+            </w:pPr>
+            <w:r/>
+            <w:r>
+              <w:rPr>
+                <w:rFonts w:ascii="Arial" w:hAnsi="Arial" w:eastAsia="Arial"/>
+                <w:b w:val="0"/>
+                <w:color w:val="1C2B2A"/>
+                <w:sz w:val="16"/>
+              </w:rPr>
+              <w:t>docs/commercial/IP-6.1-pricing-billing-model.md</w:t>
+            </w:r>
+          </w:p>
+        </w:tc>
+      </w:tr>
+      <w:tr>
+        <w:tc>
+          <w:tcPr>
+            <w:tcW w:type="dxa" w:w="1080"/>
+            <w:vAlign w:val="center"/>
+          </w:tcPr>
+          <w:p>
+            <w:pPr>
+              <w:spacing w:before="0" w:after="40"/>
+              <w:jc w:val="left"/>
+            </w:pPr>
+            <w:r/>
+            <w:r>
+              <w:rPr>
+                <w:rFonts w:ascii="Arial" w:hAnsi="Arial" w:eastAsia="Arial"/>
+                <w:b w:val="0"/>
+                <w:color w:val="1C2B2A"/>
+                <w:sz w:val="16"/>
+              </w:rPr>
+              <w:t>IP-6.6</w:t>
+            </w:r>
+          </w:p>
+        </w:tc>
+        <w:tc>
+          <w:tcPr>
+            <w:tcW w:type="dxa" w:w="3240"/>
+            <w:vAlign w:val="center"/>
+          </w:tcPr>
+          <w:p>
+            <w:pPr>
+              <w:spacing w:before="0" w:after="40"/>
+              <w:jc w:val="left"/>
+            </w:pPr>
+            <w:r/>
+            <w:r>
+              <w:rPr>
+                <w:rFonts w:ascii="Arial" w:hAnsi="Arial" w:eastAsia="Arial"/>
+                <w:b w:val="0"/>
+                <w:color w:val="1C2B2A"/>
+                <w:sz w:val="16"/>
+              </w:rPr>
+              <w:t>Patent vekili basvuru paketi: kanit matrisi, sekil listesi, istem omurgasi ve temiz-oda checklist.</w:t>
+            </w:r>
+          </w:p>
+        </w:tc>
+        <w:tc>
+          <w:tcPr>
+            <w:tcW w:type="dxa" w:w="2376"/>
+            <w:vAlign w:val="center"/>
+          </w:tcPr>
+          <w:p>
+            <w:pPr>
+              <w:spacing w:before="0" w:after="40"/>
+              <w:jc w:val="left"/>
+            </w:pPr>
+            <w:r/>
+            <w:r>
+              <w:rPr>
+                <w:rFonts w:ascii="Arial" w:hAnsi="Arial" w:eastAsia="Arial"/>
+                <w:b w:val="0"/>
+                <w:color w:val="1C2B2A"/>
+                <w:sz w:val="16"/>
+              </w:rPr>
+              <w:t>Paket hazir; vekil novelty/istem incelemesi bekliyor.</w:t>
+            </w:r>
+          </w:p>
+        </w:tc>
+        <w:tc>
+          <w:tcPr>
+            <w:tcW w:type="dxa" w:w="2952"/>
+            <w:vAlign w:val="center"/>
+          </w:tcPr>
+          <w:p>
+            <w:pPr>
+              <w:spacing w:before="0" w:after="40"/>
+              <w:jc w:val="left"/>
+            </w:pPr>
+            <w:r/>
+            <w:r>
+              <w:rPr>
+                <w:rFonts w:ascii="Arial" w:hAnsi="Arial" w:eastAsia="Arial"/>
+                <w:b w:val="0"/>
+                <w:color w:val="1C2B2A"/>
+                <w:sz w:val="16"/>
+              </w:rPr>
+              <w:t>docs/patent/IP-6.6-vekil-basvuru-paketi.md</w:t>
+            </w:r>
+          </w:p>
+        </w:tc>
+      </w:tr>
+    </w:tbl>
+    <w:p>
+      <w:pPr>
+        <w:spacing w:before="160" w:after="120"/>
+      </w:pPr>
+      <w:r>
+        <w:rPr>
+          <w:rFonts w:ascii="Arial" w:hAnsi="Arial" w:eastAsia="Arial"/>
+          <w:b/>
+          <w:color w:val="1F4E5F"/>
+          <w:sz w:val="26"/>
+        </w:rPr>
+        <w:t>13.2 Ilerleyemeyen kisimlar ve net acma kosullari</w:t>
+      </w:r>
+    </w:p>
+    <w:tbl>
+      <w:tblPr>
+        <w:tblW w:type="auto" w:w="0"/>
+        <w:jc w:val="center"/>
+        <w:tblLayout w:type="fixed"/>
+        <w:tblLook w:firstColumn="1" w:firstRow="1" w:lastColumn="0" w:lastRow="0" w:noHBand="0" w:noVBand="1" w:val="04A0"/>
+        <w:tblBorders>
+          <w:top w:val="single" w:sz="4" w:space="0" w:color="D4E3E0"/>
+          <w:left w:val="single" w:sz="4" w:space="0" w:color="D4E3E0"/>
+          <w:bottom w:val="single" w:sz="4" w:space="0" w:color="D4E3E0"/>
+          <w:right w:val="single" w:sz="4" w:space="0" w:color="D4E3E0"/>
+          <w:insideH w:val="single" w:sz="4" w:space="0" w:color="D4E3E0"/>
+          <w:insideV w:val="single" w:sz="4" w:space="0" w:color="D4E3E0"/>
+        </w:tblBorders>
+      </w:tblPr>
+      <w:tblGrid>
+        <w:gridCol w:w="3009"/>
+        <w:gridCol w:w="3009"/>
+        <w:gridCol w:w="3009"/>
+      </w:tblGrid>
+      <w:tr>
+        <w:tc>
+          <w:tcPr>
+            <w:tcW w:type="dxa" w:w="2088"/>
+            <w:vAlign w:val="center"/>
+            <w:shd w:fill="1F4E5F"/>
+          </w:tcPr>
+          <w:p>
+            <w:pPr>
+              <w:spacing w:before="0" w:after="40"/>
+              <w:jc w:val="left"/>
+            </w:pPr>
+            <w:r/>
+            <w:r>
+              <w:rPr>
+                <w:rFonts w:ascii="Arial" w:hAnsi="Arial" w:eastAsia="Arial"/>
+                <w:b/>
+                <w:color w:val="FFFFFF"/>
+                <w:sz w:val="16"/>
+              </w:rPr>
+              <w:t>Bloke madde</w:t>
+            </w:r>
+          </w:p>
+        </w:tc>
+        <w:tc>
+          <w:tcPr>
+            <w:tcW w:type="dxa" w:w="3672"/>
+            <w:vAlign w:val="center"/>
+            <w:shd w:fill="1F4E5F"/>
+          </w:tcPr>
+          <w:p>
+            <w:pPr>
+              <w:spacing w:before="0" w:after="40"/>
+              <w:jc w:val="left"/>
+            </w:pPr>
+            <w:r/>
+            <w:r>
+              <w:rPr>
+                <w:rFonts w:ascii="Arial" w:hAnsi="Arial" w:eastAsia="Arial"/>
+                <w:b/>
+                <w:color w:val="FFFFFF"/>
+                <w:sz w:val="16"/>
+              </w:rPr>
+              <w:t>Neden repoda kapanamaz</w:t>
+            </w:r>
+          </w:p>
+        </w:tc>
+        <w:tc>
+          <w:tcPr>
+            <w:tcW w:type="dxa" w:w="3960"/>
+            <w:vAlign w:val="center"/>
+            <w:shd w:fill="1F4E5F"/>
+          </w:tcPr>
+          <w:p>
+            <w:pPr>
+              <w:spacing w:before="0" w:after="40"/>
+              <w:jc w:val="left"/>
+            </w:pPr>
+            <w:r/>
+            <w:r>
+              <w:rPr>
+                <w:rFonts w:ascii="Arial" w:hAnsi="Arial" w:eastAsia="Arial"/>
+                <w:b/>
+                <w:color w:val="FFFFFF"/>
+                <w:sz w:val="16"/>
+              </w:rPr>
+              <w:t>Acilmasi icin gereken</w:t>
+            </w:r>
+          </w:p>
+        </w:tc>
+      </w:tr>
+      <w:tr>
+        <w:tc>
+          <w:tcPr>
+            <w:tcW w:type="dxa" w:w="2088"/>
+            <w:vAlign w:val="center"/>
+          </w:tcPr>
+          <w:p>
+            <w:pPr>
+              <w:spacing w:before="0" w:after="40"/>
+              <w:jc w:val="left"/>
+            </w:pPr>
+            <w:r/>
+            <w:r>
+              <w:rPr>
+                <w:rFonts w:ascii="Arial" w:hAnsi="Arial" w:eastAsia="Arial"/>
+                <w:b w:val="0"/>
+                <w:color w:val="1C2B2A"/>
+                <w:sz w:val="16"/>
+              </w:rPr>
+              <w:t>IP-3.6 model damitma</w:t>
+            </w:r>
+          </w:p>
+        </w:tc>
+        <w:tc>
+          <w:tcPr>
+            <w:tcW w:type="dxa" w:w="3672"/>
+            <w:vAlign w:val="center"/>
+          </w:tcPr>
+          <w:p>
+            <w:pPr>
+              <w:spacing w:before="0" w:after="40"/>
+              <w:jc w:val="left"/>
+            </w:pPr>
+            <w:r/>
+            <w:r>
+              <w:rPr>
+                <w:rFonts w:ascii="Arial" w:hAnsi="Arial" w:eastAsia="Arial"/>
+                <w:b w:val="0"/>
+                <w:color w:val="1C2B2A"/>
+                <w:sz w:val="16"/>
+              </w:rPr>
+              <w:t>Gercek egitim/runtime donanimi, model secimi ve yeterli etiketli veri gerekir.</w:t>
+            </w:r>
+          </w:p>
+        </w:tc>
+        <w:tc>
+          <w:tcPr>
+            <w:tcW w:type="dxa" w:w="3960"/>
+            <w:vAlign w:val="center"/>
+          </w:tcPr>
+          <w:p>
+            <w:pPr>
+              <w:spacing w:before="0" w:after="40"/>
+              <w:jc w:val="left"/>
+            </w:pPr>
+            <w:r/>
+            <w:r>
+              <w:rPr>
+                <w:rFonts w:ascii="Arial" w:hAnsi="Arial" w:eastAsia="Arial"/>
+                <w:b w:val="0"/>
+                <w:color w:val="1C2B2A"/>
+                <w:sz w:val="16"/>
+              </w:rPr>
+              <w:t>Qwen/faster model hedefi, GPU/CPU benchmark ortami, pilottan etiketli veri veya sentetik+hekim onayli egitim seti.</w:t>
+            </w:r>
+          </w:p>
+        </w:tc>
+      </w:tr>
+      <w:tr>
+        <w:tc>
+          <w:tcPr>
+            <w:tcW w:type="dxa" w:w="2088"/>
+            <w:vAlign w:val="center"/>
+          </w:tcPr>
+          <w:p>
+            <w:pPr>
+              <w:spacing w:before="0" w:after="40"/>
+              <w:jc w:val="left"/>
+            </w:pPr>
+            <w:r/>
+            <w:r>
+              <w:rPr>
+                <w:rFonts w:ascii="Arial" w:hAnsi="Arial" w:eastAsia="Arial"/>
+                <w:b w:val="0"/>
+                <w:color w:val="1C2B2A"/>
+                <w:sz w:val="16"/>
+              </w:rPr>
+              <w:t>IP-3.7 gercek-zamanli ses</w:t>
+            </w:r>
+          </w:p>
+        </w:tc>
+        <w:tc>
+          <w:tcPr>
+            <w:tcW w:type="dxa" w:w="3672"/>
+            <w:vAlign w:val="center"/>
+          </w:tcPr>
+          <w:p>
+            <w:pPr>
+              <w:spacing w:before="0" w:after="40"/>
+              <w:jc w:val="left"/>
+            </w:pPr>
+            <w:r/>
+            <w:r>
+              <w:rPr>
+                <w:rFonts w:ascii="Arial" w:hAnsi="Arial" w:eastAsia="Arial"/>
+                <w:b w:val="0"/>
+                <w:color w:val="1C2B2A"/>
+                <w:sz w:val="16"/>
+              </w:rPr>
+              <w:t>Telefon/WhatsApp voice, VAD, gurultu ve kesinti davranisi saha cihazi olmadan kanitlanamaz.</w:t>
+            </w:r>
+          </w:p>
+        </w:tc>
+        <w:tc>
+          <w:tcPr>
+            <w:tcW w:type="dxa" w:w="3960"/>
+            <w:vAlign w:val="center"/>
+          </w:tcPr>
+          <w:p>
+            <w:pPr>
+              <w:spacing w:before="0" w:after="40"/>
+              <w:jc w:val="left"/>
+            </w:pPr>
+            <w:r/>
+            <w:r>
+              <w:rPr>
+                <w:rFonts w:ascii="Arial" w:hAnsi="Arial" w:eastAsia="Arial"/>
+                <w:b w:val="0"/>
+                <w:color w:val="1C2B2A"/>
+                <w:sz w:val="16"/>
+              </w:rPr>
+              <w:t>Telephony sandbox, VAD/noise test seti, 20+ cagri senaryosu, p95 ilk-token ve kesinti KPI.</w:t>
+            </w:r>
+          </w:p>
+        </w:tc>
+      </w:tr>
+      <w:tr>
+        <w:tc>
+          <w:tcPr>
+            <w:tcW w:type="dxa" w:w="2088"/>
+            <w:vAlign w:val="center"/>
+          </w:tcPr>
+          <w:p>
+            <w:pPr>
+              <w:spacing w:before="0" w:after="40"/>
+              <w:jc w:val="left"/>
+            </w:pPr>
+            <w:r/>
+            <w:r>
+              <w:rPr>
+                <w:rFonts w:ascii="Arial" w:hAnsi="Arial" w:eastAsia="Arial"/>
+                <w:b w:val="0"/>
+                <w:color w:val="1C2B2A"/>
+                <w:sz w:val="16"/>
+              </w:rPr>
+              <w:t>IP-5.2 canli pilot kurulum</w:t>
+            </w:r>
+          </w:p>
+        </w:tc>
+        <w:tc>
+          <w:tcPr>
+            <w:tcW w:type="dxa" w:w="3672"/>
+            <w:vAlign w:val="center"/>
+          </w:tcPr>
+          <w:p>
+            <w:pPr>
+              <w:spacing w:before="0" w:after="40"/>
+              <w:jc w:val="left"/>
+            </w:pPr>
+            <w:r/>
+            <w:r>
+              <w:rPr>
+                <w:rFonts w:ascii="Arial" w:hAnsi="Arial" w:eastAsia="Arial"/>
+                <w:b w:val="0"/>
+                <w:color w:val="1C2B2A"/>
+                <w:sz w:val="16"/>
+              </w:rPr>
+              <w:t>Klinik sozlesmesi, KVKK onayi ve canli kanal erisimi gerekir.</w:t>
+            </w:r>
+          </w:p>
+        </w:tc>
+        <w:tc>
+          <w:tcPr>
+            <w:tcW w:type="dxa" w:w="3960"/>
+            <w:vAlign w:val="center"/>
+          </w:tcPr>
+          <w:p>
+            <w:pPr>
+              <w:spacing w:before="0" w:after="40"/>
+              <w:jc w:val="left"/>
+            </w:pPr>
+            <w:r/>
+            <w:r>
+              <w:rPr>
+                <w:rFonts w:ascii="Arial" w:hAnsi="Arial" w:eastAsia="Arial"/>
+                <w:b w:val="0"/>
+                <w:color w:val="1C2B2A"/>
+                <w:sz w:val="16"/>
+              </w:rPr>
+              <w:t>En az 1 design-partner klinik, imzali pilot kapsam formu, canli/staging slug karari.</w:t>
+            </w:r>
+          </w:p>
+        </w:tc>
+      </w:tr>
+      <w:tr>
+        <w:tc>
+          <w:tcPr>
+            <w:tcW w:type="dxa" w:w="2088"/>
+            <w:vAlign w:val="center"/>
+          </w:tcPr>
+          <w:p>
+            <w:pPr>
+              <w:spacing w:before="0" w:after="40"/>
+              <w:jc w:val="left"/>
+            </w:pPr>
+            <w:r/>
+            <w:r>
+              <w:rPr>
+                <w:rFonts w:ascii="Arial" w:hAnsi="Arial" w:eastAsia="Arial"/>
+                <w:b w:val="0"/>
+                <w:color w:val="1C2B2A"/>
+                <w:sz w:val="16"/>
+              </w:rPr>
+              <w:t>IP-6.8 ucretli klinik donusumu</w:t>
+            </w:r>
+          </w:p>
+        </w:tc>
+        <w:tc>
+          <w:tcPr>
+            <w:tcW w:type="dxa" w:w="3672"/>
+            <w:vAlign w:val="center"/>
+          </w:tcPr>
+          <w:p>
+            <w:pPr>
+              <w:spacing w:before="0" w:after="40"/>
+              <w:jc w:val="left"/>
+            </w:pPr>
+            <w:r/>
+            <w:r>
+              <w:rPr>
+                <w:rFonts w:ascii="Arial" w:hAnsi="Arial" w:eastAsia="Arial"/>
+                <w:b w:val="0"/>
+                <w:color w:val="1C2B2A"/>
+                <w:sz w:val="16"/>
+              </w:rPr>
+              <w:t>Odeme istekliligi ve karar verici sponsor saha gorusmesiyle olculur.</w:t>
+            </w:r>
+          </w:p>
+        </w:tc>
+        <w:tc>
+          <w:tcPr>
+            <w:tcW w:type="dxa" w:w="3960"/>
+            <w:vAlign w:val="center"/>
+          </w:tcPr>
+          <w:p>
+            <w:pPr>
+              <w:spacing w:before="0" w:after="40"/>
+              <w:jc w:val="left"/>
+            </w:pPr>
+            <w:r/>
+            <w:r>
+              <w:rPr>
+                <w:rFonts w:ascii="Arial" w:hAnsi="Arial" w:eastAsia="Arial"/>
+                <w:b w:val="0"/>
+                <w:color w:val="1C2B2A"/>
+                <w:sz w:val="16"/>
+              </w:rPr>
+              <w:t>Pilot raporu, fiyat teklifi, referans izni, ilk fatura veya LOI.</w:t>
+            </w:r>
+          </w:p>
+        </w:tc>
+      </w:tr>
+      <w:tr>
+        <w:tc>
+          <w:tcPr>
+            <w:tcW w:type="dxa" w:w="2088"/>
+            <w:vAlign w:val="center"/>
+          </w:tcPr>
+          <w:p>
+            <w:pPr>
+              <w:spacing w:before="0" w:after="40"/>
+              <w:jc w:val="left"/>
+            </w:pPr>
+            <w:r/>
+            <w:r>
+              <w:rPr>
+                <w:rFonts w:ascii="Arial" w:hAnsi="Arial" w:eastAsia="Arial"/>
+                <w:b w:val="0"/>
+                <w:color w:val="1C2B2A"/>
+                <w:sz w:val="16"/>
+              </w:rPr>
+              <w:t>Patent kesinlestirme</w:t>
+            </w:r>
+          </w:p>
+        </w:tc>
+        <w:tc>
+          <w:tcPr>
+            <w:tcW w:type="dxa" w:w="3672"/>
+            <w:vAlign w:val="center"/>
+          </w:tcPr>
+          <w:p>
+            <w:pPr>
+              <w:spacing w:before="0" w:after="40"/>
+              <w:jc w:val="left"/>
+            </w:pPr>
+            <w:r/>
+            <w:r>
+              <w:rPr>
+                <w:rFonts w:ascii="Arial" w:hAnsi="Arial" w:eastAsia="Arial"/>
+                <w:b w:val="0"/>
+                <w:color w:val="1C2B2A"/>
+                <w:sz w:val="16"/>
+              </w:rPr>
+              <w:t>Novelty ve istem dili hukuki uzmanlik gerektirir.</w:t>
+            </w:r>
+          </w:p>
+        </w:tc>
+        <w:tc>
+          <w:tcPr>
+            <w:tcW w:type="dxa" w:w="3960"/>
+            <w:vAlign w:val="center"/>
+          </w:tcPr>
+          <w:p>
+            <w:pPr>
+              <w:spacing w:before="0" w:after="40"/>
+              <w:jc w:val="left"/>
+            </w:pPr>
+            <w:r/>
+            <w:r>
+              <w:rPr>
+                <w:rFonts w:ascii="Arial" w:hAnsi="Arial" w:eastAsia="Arial"/>
+                <w:b w:val="0"/>
+                <w:color w:val="1C2B2A"/>
+                <w:sz w:val="16"/>
+              </w:rPr>
+              <w:t>Patent vekili EPATS/Espacenet aramasi, istem revizyonu, bulus sahipligi/devir belgeleri.</w:t>
+            </w:r>
+          </w:p>
+        </w:tc>
+      </w:tr>
+    </w:tbl>
+    <w:p>
+      <w:pPr>
+        <w:spacing w:before="160" w:after="120"/>
+      </w:pPr>
+      <w:r>
+        <w:rPr>
+          <w:rFonts w:ascii="Arial" w:hAnsi="Arial" w:eastAsia="Arial"/>
+          <w:b/>
+          <w:color w:val="1F4E5F"/>
+          <w:sz w:val="26"/>
+        </w:rPr>
+        <w:t>13.3 Onumuzdeki 14 gunluk top-tier icra plani</w:t>
+      </w:r>
+    </w:p>
+    <w:tbl>
+      <w:tblPr>
+        <w:tblW w:type="auto" w:w="0"/>
+        <w:jc w:val="center"/>
+        <w:tblLayout w:type="fixed"/>
+        <w:tblLook w:firstColumn="1" w:firstRow="1" w:lastColumn="0" w:lastRow="0" w:noHBand="0" w:noVBand="1" w:val="04A0"/>
+        <w:tblBorders>
+          <w:top w:val="single" w:sz="4" w:space="0" w:color="D4E3E0"/>
+          <w:left w:val="single" w:sz="4" w:space="0" w:color="D4E3E0"/>
+          <w:bottom w:val="single" w:sz="4" w:space="0" w:color="D4E3E0"/>
+          <w:right w:val="single" w:sz="4" w:space="0" w:color="D4E3E0"/>
+          <w:insideH w:val="single" w:sz="4" w:space="0" w:color="D4E3E0"/>
+          <w:insideV w:val="single" w:sz="4" w:space="0" w:color="D4E3E0"/>
+        </w:tblBorders>
+      </w:tblPr>
+      <w:tblGrid>
+        <w:gridCol w:w="2256"/>
+        <w:gridCol w:w="2256"/>
+        <w:gridCol w:w="2256"/>
+        <w:gridCol w:w="2256"/>
+      </w:tblGrid>
+      <w:tr>
+        <w:tc>
+          <w:tcPr>
+            <w:tcW w:type="dxa" w:w="936"/>
+            <w:vAlign w:val="center"/>
+            <w:shd w:fill="1F4E5F"/>
+          </w:tcPr>
+          <w:p>
+            <w:pPr>
+              <w:spacing w:before="0" w:after="40"/>
+              <w:jc w:val="left"/>
+            </w:pPr>
+            <w:r/>
+            <w:r>
+              <w:rPr>
+                <w:rFonts w:ascii="Arial" w:hAnsi="Arial" w:eastAsia="Arial"/>
+                <w:b/>
+                <w:color w:val="FFFFFF"/>
+                <w:sz w:val="16"/>
+              </w:rPr>
+              <w:t>Gun</w:t>
+            </w:r>
+          </w:p>
+        </w:tc>
+        <w:tc>
+          <w:tcPr>
+            <w:tcW w:type="dxa" w:w="3816"/>
+            <w:vAlign w:val="center"/>
+            <w:shd w:fill="1F4E5F"/>
+          </w:tcPr>
+          <w:p>
+            <w:pPr>
+              <w:spacing w:before="0" w:after="40"/>
+              <w:jc w:val="left"/>
+            </w:pPr>
+            <w:r/>
+            <w:r>
+              <w:rPr>
+                <w:rFonts w:ascii="Arial" w:hAnsi="Arial" w:eastAsia="Arial"/>
+                <w:b/>
+                <w:color w:val="FFFFFF"/>
+                <w:sz w:val="16"/>
+              </w:rPr>
+              <w:t>Eylem</w:t>
+            </w:r>
+          </w:p>
+        </w:tc>
+        <w:tc>
+          <w:tcPr>
+            <w:tcW w:type="dxa" w:w="2664"/>
+            <w:vAlign w:val="center"/>
+            <w:shd w:fill="1F4E5F"/>
+          </w:tcPr>
+          <w:p>
+            <w:pPr>
+              <w:spacing w:before="0" w:after="40"/>
+              <w:jc w:val="left"/>
+            </w:pPr>
+            <w:r/>
+            <w:r>
+              <w:rPr>
+                <w:rFonts w:ascii="Arial" w:hAnsi="Arial" w:eastAsia="Arial"/>
+                <w:b/>
+                <w:color w:val="FFFFFF"/>
+                <w:sz w:val="16"/>
+              </w:rPr>
+              <w:t>Cikti</w:t>
+            </w:r>
+          </w:p>
+        </w:tc>
+        <w:tc>
+          <w:tcPr>
+            <w:tcW w:type="dxa" w:w="2304"/>
+            <w:vAlign w:val="center"/>
+            <w:shd w:fill="1F4E5F"/>
+          </w:tcPr>
+          <w:p>
+            <w:pPr>
+              <w:spacing w:before="0" w:after="40"/>
+              <w:jc w:val="left"/>
+            </w:pPr>
+            <w:r/>
+            <w:r>
+              <w:rPr>
+                <w:rFonts w:ascii="Arial" w:hAnsi="Arial" w:eastAsia="Arial"/>
+                <w:b/>
+                <w:color w:val="FFFFFF"/>
+                <w:sz w:val="16"/>
+              </w:rPr>
+              <w:t>Kabul kapisi</w:t>
+            </w:r>
+          </w:p>
+        </w:tc>
+      </w:tr>
+      <w:tr>
+        <w:tc>
+          <w:tcPr>
+            <w:tcW w:type="dxa" w:w="936"/>
+            <w:vAlign w:val="center"/>
+          </w:tcPr>
+          <w:p>
+            <w:pPr>
+              <w:spacing w:before="0" w:after="40"/>
+              <w:jc w:val="left"/>
+            </w:pPr>
+            <w:r/>
+            <w:r>
+              <w:rPr>
+                <w:rFonts w:ascii="Arial" w:hAnsi="Arial" w:eastAsia="Arial"/>
+                <w:b w:val="0"/>
+                <w:color w:val="1C2B2A"/>
+                <w:sz w:val="16"/>
+              </w:rPr>
+              <w:t>1-2</w:t>
+            </w:r>
+          </w:p>
+        </w:tc>
+        <w:tc>
+          <w:tcPr>
+            <w:tcW w:type="dxa" w:w="3816"/>
+            <w:vAlign w:val="center"/>
+          </w:tcPr>
+          <w:p>
+            <w:pPr>
+              <w:spacing w:before="0" w:after="40"/>
+              <w:jc w:val="left"/>
+            </w:pPr>
+            <w:r/>
+            <w:r>
+              <w:rPr>
+                <w:rFonts w:ascii="Arial" w:hAnsi="Arial" w:eastAsia="Arial"/>
+                <w:b w:val="0"/>
+                <w:color w:val="1C2B2A"/>
+                <w:sz w:val="16"/>
+              </w:rPr>
+              <w:t>3-5 pilot klinik shortlist ve karar verici haritasi.</w:t>
+            </w:r>
+          </w:p>
+        </w:tc>
+        <w:tc>
+          <w:tcPr>
+            <w:tcW w:type="dxa" w:w="2664"/>
+            <w:vAlign w:val="center"/>
+          </w:tcPr>
+          <w:p>
+            <w:pPr>
+              <w:spacing w:before="0" w:after="40"/>
+              <w:jc w:val="left"/>
+            </w:pPr>
+            <w:r/>
+            <w:r>
+              <w:rPr>
+                <w:rFonts w:ascii="Arial" w:hAnsi="Arial" w:eastAsia="Arial"/>
+                <w:b w:val="0"/>
+                <w:color w:val="1C2B2A"/>
+                <w:sz w:val="16"/>
+              </w:rPr>
+              <w:t>Klinik aday tablosu + iletisim sahibi.</w:t>
+            </w:r>
+          </w:p>
+        </w:tc>
+        <w:tc>
+          <w:tcPr>
+            <w:tcW w:type="dxa" w:w="2304"/>
+            <w:vAlign w:val="center"/>
+          </w:tcPr>
+          <w:p>
+            <w:pPr>
+              <w:spacing w:before="0" w:after="40"/>
+              <w:jc w:val="left"/>
+            </w:pPr>
+            <w:r/>
+            <w:r>
+              <w:rPr>
+                <w:rFonts w:ascii="Arial" w:hAnsi="Arial" w:eastAsia="Arial"/>
+                <w:b w:val="0"/>
+                <w:color w:val="1C2B2A"/>
+                <w:sz w:val="16"/>
+              </w:rPr>
+              <w:t>En az 5 nitelikli aday.</w:t>
+            </w:r>
+          </w:p>
+        </w:tc>
+      </w:tr>
+      <w:tr>
+        <w:tc>
+          <w:tcPr>
+            <w:tcW w:type="dxa" w:w="936"/>
+            <w:vAlign w:val="center"/>
+          </w:tcPr>
+          <w:p>
+            <w:pPr>
+              <w:spacing w:before="0" w:after="40"/>
+              <w:jc w:val="left"/>
+            </w:pPr>
+            <w:r/>
+            <w:r>
+              <w:rPr>
+                <w:rFonts w:ascii="Arial" w:hAnsi="Arial" w:eastAsia="Arial"/>
+                <w:b w:val="0"/>
+                <w:color w:val="1C2B2A"/>
+                <w:sz w:val="16"/>
+              </w:rPr>
+              <w:t>3-4</w:t>
+            </w:r>
+          </w:p>
+        </w:tc>
+        <w:tc>
+          <w:tcPr>
+            <w:tcW w:type="dxa" w:w="3816"/>
+            <w:vAlign w:val="center"/>
+          </w:tcPr>
+          <w:p>
+            <w:pPr>
+              <w:spacing w:before="0" w:after="40"/>
+              <w:jc w:val="left"/>
+            </w:pPr>
+            <w:r/>
+            <w:r>
+              <w:rPr>
+                <w:rFonts w:ascii="Arial" w:hAnsi="Arial" w:eastAsia="Arial"/>
+                <w:b w:val="0"/>
+                <w:color w:val="1C2B2A"/>
+                <w:sz w:val="16"/>
+              </w:rPr>
+              <w:t>Pilot teklif deck/mail ve KVKK/sozlesme taslaklarini avukata hazirla.</w:t>
+            </w:r>
+          </w:p>
+        </w:tc>
+        <w:tc>
+          <w:tcPr>
+            <w:tcW w:type="dxa" w:w="2664"/>
+            <w:vAlign w:val="center"/>
+          </w:tcPr>
+          <w:p>
+            <w:pPr>
+              <w:spacing w:before="0" w:after="40"/>
+              <w:jc w:val="left"/>
+            </w:pPr>
+            <w:r/>
+            <w:r>
+              <w:rPr>
+                <w:rFonts w:ascii="Arial" w:hAnsi="Arial" w:eastAsia="Arial"/>
+                <w:b w:val="0"/>
+                <w:color w:val="1C2B2A"/>
+                <w:sz w:val="16"/>
+              </w:rPr>
+              <w:t>Gonderilebilir pilot paketi.</w:t>
+            </w:r>
+          </w:p>
+        </w:tc>
+        <w:tc>
+          <w:tcPr>
+            <w:tcW w:type="dxa" w:w="2304"/>
+            <w:vAlign w:val="center"/>
+          </w:tcPr>
+          <w:p>
+            <w:pPr>
+              <w:spacing w:before="0" w:after="40"/>
+              <w:jc w:val="left"/>
+            </w:pPr>
+            <w:r/>
+            <w:r>
+              <w:rPr>
+                <w:rFonts w:ascii="Arial" w:hAnsi="Arial" w:eastAsia="Arial"/>
+                <w:b w:val="0"/>
+                <w:color w:val="1C2B2A"/>
+                <w:sz w:val="16"/>
+              </w:rPr>
+              <w:t>Avukat/kurucu onayi.</w:t>
+            </w:r>
+          </w:p>
+        </w:tc>
+      </w:tr>
+      <w:tr>
+        <w:tc>
+          <w:tcPr>
+            <w:tcW w:type="dxa" w:w="936"/>
+            <w:vAlign w:val="center"/>
+          </w:tcPr>
+          <w:p>
+            <w:pPr>
+              <w:spacing w:before="0" w:after="40"/>
+              <w:jc w:val="left"/>
+            </w:pPr>
+            <w:r/>
+            <w:r>
+              <w:rPr>
+                <w:rFonts w:ascii="Arial" w:hAnsi="Arial" w:eastAsia="Arial"/>
+                <w:b w:val="0"/>
+                <w:color w:val="1C2B2A"/>
+                <w:sz w:val="16"/>
+              </w:rPr>
+              <w:t>5-7</w:t>
+            </w:r>
+          </w:p>
+        </w:tc>
+        <w:tc>
+          <w:tcPr>
+            <w:tcW w:type="dxa" w:w="3816"/>
+            <w:vAlign w:val="center"/>
+          </w:tcPr>
+          <w:p>
+            <w:pPr>
+              <w:spacing w:before="0" w:after="40"/>
+              <w:jc w:val="left"/>
+            </w:pPr>
+            <w:r/>
+            <w:r>
+              <w:rPr>
+                <w:rFonts w:ascii="Arial" w:hAnsi="Arial" w:eastAsia="Arial"/>
+                <w:b w:val="0"/>
+                <w:color w:val="1C2B2A"/>
+                <w:sz w:val="16"/>
+              </w:rPr>
+              <w:t>2 klinikle kesif gorusmesi ve onboarding bilgi formu doldurma.</w:t>
+            </w:r>
+          </w:p>
+        </w:tc>
+        <w:tc>
+          <w:tcPr>
+            <w:tcW w:type="dxa" w:w="2664"/>
+            <w:vAlign w:val="center"/>
+          </w:tcPr>
+          <w:p>
+            <w:pPr>
+              <w:spacing w:before="0" w:after="40"/>
+              <w:jc w:val="left"/>
+            </w:pPr>
+            <w:r/>
+            <w:r>
+              <w:rPr>
+                <w:rFonts w:ascii="Arial" w:hAnsi="Arial" w:eastAsia="Arial"/>
+                <w:b w:val="0"/>
+                <w:color w:val="1C2B2A"/>
+                <w:sz w:val="16"/>
+              </w:rPr>
+              <w:t>Problem/fiyat/kanal sinyali.</w:t>
+            </w:r>
+          </w:p>
+        </w:tc>
+        <w:tc>
+          <w:tcPr>
+            <w:tcW w:type="dxa" w:w="2304"/>
+            <w:vAlign w:val="center"/>
+          </w:tcPr>
+          <w:p>
+            <w:pPr>
+              <w:spacing w:before="0" w:after="40"/>
+              <w:jc w:val="left"/>
+            </w:pPr>
+            <w:r/>
+            <w:r>
+              <w:rPr>
+                <w:rFonts w:ascii="Arial" w:hAnsi="Arial" w:eastAsia="Arial"/>
+                <w:b w:val="0"/>
+                <w:color w:val="1C2B2A"/>
+                <w:sz w:val="16"/>
+              </w:rPr>
+              <w:t>En az 1 sicak design partner.</w:t>
+            </w:r>
+          </w:p>
+        </w:tc>
+      </w:tr>
+      <w:tr>
+        <w:tc>
+          <w:tcPr>
+            <w:tcW w:type="dxa" w:w="936"/>
+            <w:vAlign w:val="center"/>
+          </w:tcPr>
+          <w:p>
+            <w:pPr>
+              <w:spacing w:before="0" w:after="40"/>
+              <w:jc w:val="left"/>
+            </w:pPr>
+            <w:r/>
+            <w:r>
+              <w:rPr>
+                <w:rFonts w:ascii="Arial" w:hAnsi="Arial" w:eastAsia="Arial"/>
+                <w:b w:val="0"/>
+                <w:color w:val="1C2B2A"/>
+                <w:sz w:val="16"/>
+              </w:rPr>
+              <w:t>8-10</w:t>
+            </w:r>
+          </w:p>
+        </w:tc>
+        <w:tc>
+          <w:tcPr>
+            <w:tcW w:type="dxa" w:w="3816"/>
+            <w:vAlign w:val="center"/>
+          </w:tcPr>
+          <w:p>
+            <w:pPr>
+              <w:spacing w:before="0" w:after="40"/>
+              <w:jc w:val="left"/>
+            </w:pPr>
+            <w:r/>
+            <w:r>
+              <w:rPr>
+                <w:rFonts w:ascii="Arial" w:hAnsi="Arial" w:eastAsia="Arial"/>
+                <w:b w:val="0"/>
+                <w:color w:val="1C2B2A"/>
+                <w:sz w:val="16"/>
+              </w:rPr>
+              <w:t>Staging klinik kurulumunu playbook ile kronometreli dene.</w:t>
+            </w:r>
+          </w:p>
+        </w:tc>
+        <w:tc>
+          <w:tcPr>
+            <w:tcW w:type="dxa" w:w="2664"/>
+            <w:vAlign w:val="center"/>
+          </w:tcPr>
+          <w:p>
+            <w:pPr>
+              <w:spacing w:before="0" w:after="40"/>
+              <w:jc w:val="left"/>
+            </w:pPr>
+            <w:r/>
+            <w:r>
+              <w:rPr>
+                <w:rFonts w:ascii="Arial" w:hAnsi="Arial" w:eastAsia="Arial"/>
+                <w:b w:val="0"/>
+                <w:color w:val="1C2B2A"/>
+                <w:sz w:val="16"/>
+              </w:rPr>
+              <w:t>Kurulum sure raporu.</w:t>
+            </w:r>
+          </w:p>
+        </w:tc>
+        <w:tc>
+          <w:tcPr>
+            <w:tcW w:type="dxa" w:w="2304"/>
+            <w:vAlign w:val="center"/>
+          </w:tcPr>
+          <w:p>
+            <w:pPr>
+              <w:spacing w:before="0" w:after="40"/>
+              <w:jc w:val="left"/>
+            </w:pPr>
+            <w:r/>
+            <w:r>
+              <w:rPr>
+                <w:rFonts w:ascii="Arial" w:hAnsi="Arial" w:eastAsia="Arial"/>
+                <w:b w:val="0"/>
+                <w:color w:val="1C2B2A"/>
+                <w:sz w:val="16"/>
+              </w:rPr>
+              <w:t>&lt;= 6 saat aktif sure hedefi.</w:t>
+            </w:r>
+          </w:p>
+        </w:tc>
+      </w:tr>
+      <w:tr>
+        <w:tc>
+          <w:tcPr>
+            <w:tcW w:type="dxa" w:w="936"/>
+            <w:vAlign w:val="center"/>
+          </w:tcPr>
+          <w:p>
+            <w:pPr>
+              <w:spacing w:before="0" w:after="40"/>
+              <w:jc w:val="left"/>
+            </w:pPr>
+            <w:r/>
+            <w:r>
+              <w:rPr>
+                <w:rFonts w:ascii="Arial" w:hAnsi="Arial" w:eastAsia="Arial"/>
+                <w:b w:val="0"/>
+                <w:color w:val="1C2B2A"/>
+                <w:sz w:val="16"/>
+              </w:rPr>
+              <w:t>11-12</w:t>
+            </w:r>
+          </w:p>
+        </w:tc>
+        <w:tc>
+          <w:tcPr>
+            <w:tcW w:type="dxa" w:w="3816"/>
+            <w:vAlign w:val="center"/>
+          </w:tcPr>
+          <w:p>
+            <w:pPr>
+              <w:spacing w:before="0" w:after="40"/>
+              <w:jc w:val="left"/>
+            </w:pPr>
+            <w:r/>
+            <w:r>
+              <w:rPr>
+                <w:rFonts w:ascii="Arial" w:hAnsi="Arial" w:eastAsia="Arial"/>
+                <w:b w:val="0"/>
+                <w:color w:val="1C2B2A"/>
+                <w:sz w:val="16"/>
+              </w:rPr>
+              <w:t>Pricing teklifini klinik geri bildirimiyle revize et.</w:t>
+            </w:r>
+          </w:p>
+        </w:tc>
+        <w:tc>
+          <w:tcPr>
+            <w:tcW w:type="dxa" w:w="2664"/>
+            <w:vAlign w:val="center"/>
+          </w:tcPr>
+          <w:p>
+            <w:pPr>
+              <w:spacing w:before="0" w:after="40"/>
+              <w:jc w:val="left"/>
+            </w:pPr>
+            <w:r/>
+            <w:r>
+              <w:rPr>
+                <w:rFonts w:ascii="Arial" w:hAnsi="Arial" w:eastAsia="Arial"/>
+                <w:b w:val="0"/>
+                <w:color w:val="1C2B2A"/>
+                <w:sz w:val="16"/>
+              </w:rPr>
+              <w:t>Starter/Growth teklif finali.</w:t>
+            </w:r>
+          </w:p>
+        </w:tc>
+        <w:tc>
+          <w:tcPr>
+            <w:tcW w:type="dxa" w:w="2304"/>
+            <w:vAlign w:val="center"/>
+          </w:tcPr>
+          <w:p>
+            <w:pPr>
+              <w:spacing w:before="0" w:after="40"/>
+              <w:jc w:val="left"/>
+            </w:pPr>
+            <w:r/>
+            <w:r>
+              <w:rPr>
+                <w:rFonts w:ascii="Arial" w:hAnsi="Arial" w:eastAsia="Arial"/>
+                <w:b w:val="0"/>
+                <w:color w:val="1C2B2A"/>
+                <w:sz w:val="16"/>
+              </w:rPr>
+              <w:t>Karar verici tarafindan anlasilir bulunmasi.</w:t>
+            </w:r>
+          </w:p>
+        </w:tc>
+      </w:tr>
+      <w:tr>
+        <w:tc>
+          <w:tcPr>
+            <w:tcW w:type="dxa" w:w="936"/>
+            <w:vAlign w:val="center"/>
+          </w:tcPr>
+          <w:p>
+            <w:pPr>
+              <w:spacing w:before="0" w:after="40"/>
+              <w:jc w:val="left"/>
+            </w:pPr>
+            <w:r/>
+            <w:r>
+              <w:rPr>
+                <w:rFonts w:ascii="Arial" w:hAnsi="Arial" w:eastAsia="Arial"/>
+                <w:b w:val="0"/>
+                <w:color w:val="1C2B2A"/>
+                <w:sz w:val="16"/>
+              </w:rPr>
+              <w:t>13-14</w:t>
+            </w:r>
+          </w:p>
+        </w:tc>
+        <w:tc>
+          <w:tcPr>
+            <w:tcW w:type="dxa" w:w="3816"/>
+            <w:vAlign w:val="center"/>
+          </w:tcPr>
+          <w:p>
+            <w:pPr>
+              <w:spacing w:before="0" w:after="40"/>
+              <w:jc w:val="left"/>
+            </w:pPr>
+            <w:r/>
+            <w:r>
+              <w:rPr>
+                <w:rFonts w:ascii="Arial" w:hAnsi="Arial" w:eastAsia="Arial"/>
+                <w:b w:val="0"/>
+                <w:color w:val="1C2B2A"/>
+                <w:sz w:val="16"/>
+              </w:rPr>
+              <w:t>Pilot go/no-go ve patent vekili gorusmesini planla.</w:t>
+            </w:r>
+          </w:p>
+        </w:tc>
+        <w:tc>
+          <w:tcPr>
+            <w:tcW w:type="dxa" w:w="2664"/>
+            <w:vAlign w:val="center"/>
+          </w:tcPr>
+          <w:p>
+            <w:pPr>
+              <w:spacing w:before="0" w:after="40"/>
+              <w:jc w:val="left"/>
+            </w:pPr>
+            <w:r/>
+            <w:r>
+              <w:rPr>
+                <w:rFonts w:ascii="Arial" w:hAnsi="Arial" w:eastAsia="Arial"/>
+                <w:b w:val="0"/>
+                <w:color w:val="1C2B2A"/>
+                <w:sz w:val="16"/>
+              </w:rPr>
+              <w:t>30 gunluk pilot takvimi + vekil soru seti.</w:t>
+            </w:r>
+          </w:p>
+        </w:tc>
+        <w:tc>
+          <w:tcPr>
+            <w:tcW w:type="dxa" w:w="2304"/>
+            <w:vAlign w:val="center"/>
+          </w:tcPr>
+          <w:p>
+            <w:pPr>
+              <w:spacing w:before="0" w:after="40"/>
+              <w:jc w:val="left"/>
+            </w:pPr>
+            <w:r/>
+            <w:r>
+              <w:rPr>
+                <w:rFonts w:ascii="Arial" w:hAnsi="Arial" w:eastAsia="Arial"/>
+                <w:b w:val="0"/>
+                <w:color w:val="1C2B2A"/>
+                <w:sz w:val="16"/>
+              </w:rPr>
+              <w:t>Tarih, sahip ve sonraki adim net.</w:t>
+            </w:r>
+          </w:p>
+        </w:tc>
+      </w:tr>
+    </w:tbl>
+    <w:p>
+      <w:pPr>
+        <w:spacing w:before="160" w:after="120"/>
+      </w:pPr>
+      <w:r>
+        <w:rPr>
+          <w:rFonts w:ascii="Arial" w:hAnsi="Arial" w:eastAsia="Arial"/>
+          <w:b/>
+          <w:color w:val="1F4E5F"/>
+          <w:sz w:val="26"/>
+        </w:rPr>
+        <w:t>13.4 Kapanis tanimi</w:t>
+      </w:r>
+    </w:p>
+    <w:p>
+      <w:pPr>
+        <w:spacing w:after="40"/>
+        <w:ind w:left="360" w:hanging="173"/>
+      </w:pPr>
+      <w:r>
+        <w:rPr>
+          <w:rFonts w:ascii="Arial" w:hAnsi="Arial" w:eastAsia="Arial"/>
+          <w:color w:val="1C2B2A"/>
+          <w:sz w:val="20"/>
+        </w:rPr>
+        <w:t>- IP-5.1 gercek kapanis: en az 3 pilot klinik adayi, 1 imzali/sozlu design-partner taahhudu, KVKK/sozlesme sureci baslamis olmasi.</w:t>
+      </w:r>
+    </w:p>
+    <w:p>
+      <w:pPr>
+        <w:spacing w:after="40"/>
+        <w:ind w:left="360" w:hanging="173"/>
+      </w:pPr>
+      <w:r>
+        <w:rPr>
+          <w:rFonts w:ascii="Arial" w:hAnsi="Arial" w:eastAsia="Arial"/>
+          <w:color w:val="1C2B2A"/>
+          <w:sz w:val="20"/>
+        </w:rPr>
+        <w:t>- IP-6.3 gercek kapanis: playbook ile bir klinik staging kurulumunun 6 saat veya altinda tamamlanmasi ve 10/10 kabul testinin gecmesi.</w:t>
+      </w:r>
+    </w:p>
+    <w:p>
+      <w:pPr>
+        <w:spacing w:after="40"/>
+        <w:ind w:left="360" w:hanging="173"/>
+      </w:pPr>
+      <w:r>
+        <w:rPr>
+          <w:rFonts w:ascii="Arial" w:hAnsi="Arial" w:eastAsia="Arial"/>
+          <w:color w:val="1C2B2A"/>
+          <w:sz w:val="20"/>
+        </w:rPr>
+        <w:t>- IP-6.1 gercek kapanis: en az 2 klinikten fiyat/odeme istekliligi geri bildirimi ve bir ucretli plana gecis teklifi.</w:t>
+      </w:r>
+    </w:p>
+    <w:p>
+      <w:pPr>
+        <w:spacing w:after="40"/>
+        <w:ind w:left="360" w:hanging="173"/>
+      </w:pPr>
+      <w:r>
+        <w:rPr>
+          <w:rFonts w:ascii="Arial" w:hAnsi="Arial" w:eastAsia="Arial"/>
+          <w:color w:val="1C2B2A"/>
+          <w:sz w:val="20"/>
+        </w:rPr>
+        <w:t>- Patent sureci gercek kapanis: vekilin novelty aramasini tamamlamasi, istem agacini revize etmesi ve basvuru stratejisini yazili onaylamasi.</w:t>
+      </w:r>
+    </w:p>
+    <w:p>
+      <w:pPr>
+        <w:spacing w:before="200" w:after="0" w:line="259" w:lineRule="auto"/>
+      </w:pPr>
+      <w:r>
+        <w:rPr>
+          <w:rFonts w:ascii="Arial" w:hAnsi="Arial" w:eastAsia="Arial"/>
+          <w:i/>
+          <w:color w:val="1C2B2A"/>
+          <w:sz w:val="21"/>
+        </w:rPr>
+        <w:t>Not: Bu ek, 30 Haziran 2026 itibariyla teknik ilerleme sonrasi saha ve ticari dogrulama planini yansitir. Tamamlandi olarak isaretlenenler yalnizca repo/masa-basi paketleridir; klinik, hukuk ve odeme validasyonu gerektiren maddeler bilincli olarak acik tutulmustur.</w:t>
       </w:r>
     </w:p>
     <w:sectPr>

</xml_diff>